<commit_message>
docs: enunciado y rúbrica oficiales en docs/enunciado; títulos 4 y 4.5 según el enunciado
Co-Authored-By: Claude Opus 5.5 <noreply@anthropic.com>
Claude-Session: https://claude.ai/code/session_017At5ju5q4WB7xBrCaeEAT7
</commit_message>
<xml_diff>
--- a/docs/entregas/Entrega2_Seccion_4_Arquitectura_Controles.docx
+++ b/docs/entregas/Entrega2_Seccion_4_Arquitectura_Controles.docx
@@ -8,7 +8,7 @@
         <w:spacing w:before="0" w:after="160" w:line="360" w:lineRule="auto"/>
       </w:pPr>
       <w:r>
-        <w:t>4. [VERIFICAR: título de la sección 4 según el enunciado]</w:t>
+        <w:t>4. Mitigación y ciberseguridad</w:t>
       </w:r>
     </w:p>
     <w:p>
@@ -9036,7 +9036,7 @@
         <w:spacing w:before="0" w:after="160" w:line="360" w:lineRule="auto"/>
       </w:pPr>
       <w:r>
-        <w:t>4.5 [VERIFICAR: título según el enunciado] Revisión de la infraestructura como código</w:t>
+        <w:t>4.5 Hardening de infraestructura cloud</w:t>
       </w:r>
     </w:p>
     <w:p>
@@ -9050,7 +9050,7 @@
           <w:i w:val="0"/>
           <w:sz w:val="24"/>
         </w:rPr>
-        <w:t>Revisamos el Terraform con Checkov 3.3.22 en cada pull request, antes de que algo llegue a AWS (evidencia EVD-3-06). El primer análisis completo, del 29 de octubre de 2026, revisó 125 bloques de Terraform: 282 verificaciones pasaron, 0 fallaron y 39 se omitieron con justificación. Cada omisión está escrita junto al recurso en el propio código, con el formato #checkov:skip=ID:motivo, para que el motivo quede a la vista de quien revisa. El Dockerfile de las Lambdas pasó las 5 verificaciones que le aplican.</w:t>
+        <w:t>El endurecimiento de la infraestructura cloud se aplica en el propio Terraform (secciones 4.1 y 4.2) y se audita de forma automática. Revisamos el Terraform con Checkov 3.3.22 en cada pull request, antes de que algo llegue a AWS (evidencia EVD-3-06). El primer análisis completo, del 29 de octubre de 2026, revisó 125 bloques de Terraform: 282 verificaciones pasaron, 0 fallaron y 39 se omitieron con justificación. Cada omisión está escrita junto al recurso en el propio código, con el formato #checkov:skip=ID:motivo, para que el motivo quede a la vista de quien revisa. El Dockerfile de las Lambdas pasó las 5 verificaciones que le aplican.</w:t>
       </w:r>
     </w:p>
     <w:p>

</xml_diff>